<commit_message>
Replace downloadable Word resume
</commit_message>
<xml_diff>
--- a/downloads/huang-liqiang-resume.docx
+++ b/downloads/huang-liqiang-resume.docx
@@ -119,7 +119,7 @@
           <w:szCs w:val="21"/>
           <w:lang w:val="en-US" w:eastAsia="zh-CN"/>
         </w:rPr>
-        <w:t>2D角色</w:t>
+        <w:t>角色</w:t>
       </w:r>
       <w:r>
         <w:rPr>
@@ -383,7 +383,28 @@
           <w:sz w:val="22"/>
           <w:szCs w:val="21"/>
         </w:rPr>
-        <w:t>13年游戏美术经验，曾任《剑侠情缘手游》主美，统筹25人以上项目美术团队。具备角色外观体系建设、</w:t>
+        <w:t>13年游戏美术经验，曾任</w:t>
+      </w:r>
+      <w:r>
+        <w:rPr>
+          <w:rFonts w:hint="eastAsia" w:ascii="微软雅黑" w:hAnsi="微软雅黑" w:eastAsia="微软雅黑" w:cs="微软雅黑"/>
+          <w:b/>
+          <w:color w:val="2F5B78"/>
+          <w:sz w:val="22"/>
+          <w:szCs w:val="21"/>
+          <w:lang w:val="en-US" w:eastAsia="zh-CN"/>
+        </w:rPr>
+        <w:t>7年</w:t>
+      </w:r>
+      <w:r>
+        <w:rPr>
+          <w:rFonts w:hint="eastAsia" w:ascii="微软雅黑" w:hAnsi="微软雅黑" w:eastAsia="微软雅黑" w:cs="微软雅黑"/>
+          <w:b/>
+          <w:color w:val="2F5B78"/>
+          <w:sz w:val="22"/>
+          <w:szCs w:val="21"/>
+        </w:rPr>
+        <w:t>《剑侠情缘手游》主美，统筹25人以上项目美术团队。具备角色外观体系建设、</w:t>
       </w:r>
       <w:r>
         <w:rPr>
@@ -459,8 +480,8 @@
         </w:rPr>
         <w:drawing>
           <wp:inline distT="0" distB="0" distL="114300" distR="114300">
-            <wp:extent cx="467995" cy="183515"/>
-            <wp:effectExtent l="0" t="0" r="8255" b="6985"/>
+            <wp:extent cx="636905" cy="250190"/>
+            <wp:effectExtent l="0" t="0" r="10795" b="16510"/>
             <wp:docPr id="5" name="Picture 5"/>
             <wp:cNvGraphicFramePr>
               <a:graphicFrameLocks xmlns:a="http://schemas.openxmlformats.org/drawingml/2006/main" noChangeAspect="1"/>
@@ -483,7 +504,7 @@
                   <pic:spPr>
                     <a:xfrm>
                       <a:off x="0" y="0"/>
-                      <a:ext cx="468000" cy="184000"/>
+                      <a:ext cx="636905" cy="250190"/>
                     </a:xfrm>
                     <a:prstGeom prst="rect">
                       <a:avLst/>
@@ -502,7 +523,27 @@
           <w:sz w:val="16"/>
           <w:szCs w:val="20"/>
         </w:rPr>
-        <w:t xml:space="preserve">  珠海剑心互动娱乐有限公司（西山居）  |  2016.05 至今</w:t>
+        <w:t xml:space="preserve">  </w:t>
+      </w:r>
+      <w:r>
+        <w:rPr>
+          <w:rFonts w:hint="eastAsia" w:ascii="微软雅黑" w:hAnsi="微软雅黑" w:eastAsia="微软雅黑" w:cs="微软雅黑"/>
+          <w:b/>
+          <w:sz w:val="20"/>
+          <w:szCs w:val="22"/>
+        </w:rPr>
+        <w:t>珠海剑心互动娱乐有限公司（西山居）  |  2016.05 至</w:t>
+      </w:r>
+      <w:bookmarkStart w:id="0" w:name="_GoBack"/>
+      <w:bookmarkEnd w:id="0"/>
+      <w:r>
+        <w:rPr>
+          <w:rFonts w:hint="eastAsia" w:ascii="微软雅黑" w:hAnsi="微软雅黑" w:eastAsia="微软雅黑" w:cs="微软雅黑"/>
+          <w:b/>
+          <w:sz w:val="20"/>
+          <w:szCs w:val="22"/>
+        </w:rPr>
+        <w:t>今</w:t>
       </w:r>
     </w:p>
     <w:p>
@@ -531,7 +572,26 @@
           <w:sz w:val="21"/>
           <w:szCs w:val="20"/>
         </w:rPr>
-        <w:t>2D角色组长（2026.08 至今）；《剑侠情缘手游》主美（2019.12 至 2026.08）；角色原画设计、美宣组长（2016.05 至 2019.11）。</w:t>
+        <w:t xml:space="preserve">《剑侠情缘手游》主美（2019.12 </w:t>
+      </w:r>
+      <w:r>
+        <w:rPr>
+          <w:rFonts w:hint="eastAsia" w:ascii="微软雅黑" w:hAnsi="微软雅黑" w:eastAsia="微软雅黑" w:cs="微软雅黑"/>
+          <w:b w:val="0"/>
+          <w:sz w:val="21"/>
+          <w:szCs w:val="20"/>
+          <w:lang w:val="en-US" w:eastAsia="zh-CN"/>
+        </w:rPr>
+        <w:t>至今</w:t>
+      </w:r>
+      <w:r>
+        <w:rPr>
+          <w:rFonts w:hint="eastAsia" w:ascii="微软雅黑" w:hAnsi="微软雅黑" w:eastAsia="微软雅黑" w:cs="微软雅黑"/>
+          <w:b w:val="0"/>
+          <w:sz w:val="21"/>
+          <w:szCs w:val="20"/>
+        </w:rPr>
+        <w:t>）；角色原画设计、美宣组长（2016.05 至 2019.11）。</w:t>
       </w:r>
     </w:p>
     <w:p>
@@ -697,9 +757,10 @@
         <w:spacing w:before="0" w:after="50"/>
         <w:ind w:left="170" w:hanging="170"/>
         <w:rPr>
-          <w:rFonts w:hint="eastAsia" w:ascii="微软雅黑" w:hAnsi="微软雅黑" w:eastAsia="微软雅黑" w:cs="微软雅黑"/>
-          <w:sz w:val="21"/>
-          <w:szCs w:val="20"/>
+          <w:rFonts w:hint="default" w:ascii="微软雅黑" w:hAnsi="微软雅黑" w:eastAsia="微软雅黑" w:cs="微软雅黑"/>
+          <w:sz w:val="21"/>
+          <w:szCs w:val="20"/>
+          <w:lang w:val="en-US" w:eastAsia="zh-CN"/>
         </w:rPr>
       </w:pPr>
       <w:r>
@@ -769,11 +830,76 @@
       <w:r>
         <w:rPr>
           <w:rFonts w:hint="eastAsia" w:ascii="微软雅黑" w:hAnsi="微软雅黑" w:eastAsia="微软雅黑" w:cs="微软雅黑"/>
+          <w:b/>
+          <w:bCs/>
+          <w:sz w:val="21"/>
+          <w:szCs w:val="20"/>
+        </w:rPr>
+        <w:t>，</w:t>
+      </w:r>
+      <w:r>
+        <w:rPr>
+          <w:rFonts w:hint="eastAsia" w:ascii="微软雅黑" w:hAnsi="微软雅黑" w:eastAsia="微软雅黑" w:cs="微软雅黑"/>
+          <w:b/>
+          <w:bCs/>
+          <w:sz w:val="21"/>
+          <w:szCs w:val="20"/>
+          <w:lang w:val="en-US" w:eastAsia="zh-CN"/>
+        </w:rPr>
+        <w:t>根据策略</w:t>
+      </w:r>
+      <w:r>
+        <w:rPr>
+          <w:rFonts w:hint="eastAsia" w:ascii="微软雅黑" w:hAnsi="微软雅黑" w:eastAsia="微软雅黑" w:cs="微软雅黑"/>
+          <w:b/>
+          <w:bCs/>
+          <w:sz w:val="21"/>
+          <w:szCs w:val="20"/>
+        </w:rPr>
+        <w:t>持续迭代</w:t>
+      </w:r>
+      <w:r>
+        <w:rPr>
+          <w:rFonts w:hint="eastAsia" w:ascii="微软雅黑" w:hAnsi="微软雅黑" w:eastAsia="微软雅黑" w:cs="微软雅黑"/>
+          <w:b/>
+          <w:bCs/>
+          <w:sz w:val="21"/>
+          <w:szCs w:val="20"/>
+          <w:lang w:val="en-US" w:eastAsia="zh-CN"/>
+        </w:rPr>
+        <w:t>设计思路</w:t>
+      </w:r>
+      <w:r>
+        <w:rPr>
+          <w:rFonts w:hint="eastAsia" w:ascii="微软雅黑" w:hAnsi="微软雅黑" w:eastAsia="微软雅黑" w:cs="微软雅黑"/>
+          <w:b/>
+          <w:bCs/>
+          <w:sz w:val="21"/>
+          <w:szCs w:val="20"/>
+          <w:lang w:eastAsia="zh-CN"/>
+        </w:rPr>
+        <w:t>，</w:t>
+      </w:r>
+      <w:r>
+        <w:rPr>
+          <w:rFonts w:hint="eastAsia" w:ascii="微软雅黑" w:hAnsi="微软雅黑" w:eastAsia="微软雅黑" w:cs="微软雅黑"/>
+          <w:b/>
+          <w:bCs/>
+          <w:sz w:val="21"/>
+          <w:szCs w:val="20"/>
+          <w:lang w:val="en-US" w:eastAsia="zh-CN"/>
+        </w:rPr>
+        <w:t>持续根据预算调整落地策略</w:t>
+      </w:r>
+      <w:r>
+        <w:rPr>
+          <w:rFonts w:hint="eastAsia" w:ascii="微软雅黑" w:hAnsi="微软雅黑" w:eastAsia="微软雅黑" w:cs="微软雅黑"/>
           <w:b w:val="0"/>
           <w:sz w:val="21"/>
           <w:szCs w:val="20"/>
-        </w:rPr>
-        <w:t>，持续迭代设计与落地方案。</w:t>
+          <w:lang w:val="en-US" w:eastAsia="zh-CN"/>
+        </w:rPr>
+        <w:t>。</w:t>
       </w:r>
     </w:p>
     <w:p>
@@ -944,6 +1070,16 @@
       <w:r>
         <w:rPr>
           <w:rFonts w:hint="eastAsia" w:ascii="微软雅黑" w:hAnsi="微软雅黑" w:eastAsia="微软雅黑" w:cs="微软雅黑"/>
+          <w:b/>
+          <w:sz w:val="21"/>
+          <w:szCs w:val="20"/>
+          <w:lang w:val="en-US" w:eastAsia="zh-CN"/>
+        </w:rPr>
+        <w:t>把关所有核心美术资源、</w:t>
+      </w:r>
+      <w:r>
+        <w:rPr>
+          <w:rFonts w:hint="eastAsia" w:ascii="微软雅黑" w:hAnsi="微软雅黑" w:eastAsia="微软雅黑" w:cs="微软雅黑"/>
           <w:b w:val="0"/>
           <w:sz w:val="21"/>
           <w:szCs w:val="20"/>
@@ -996,7 +1132,7 @@
           <w:szCs w:val="20"/>
           <w:lang w:val="en-US" w:eastAsia="zh-CN"/>
         </w:rPr>
-        <w:t>几个大型新地图和新活动</w:t>
+        <w:t>6个大型新地图和新活动</w:t>
       </w:r>
       <w:r>
         <w:rPr>
@@ -1218,7 +1354,28 @@
           <w:sz w:val="21"/>
           <w:szCs w:val="20"/>
         </w:rPr>
-        <w:t>《代号零》与《山海经》  |  前期风格探索与关键角色设计</w:t>
+        <w:t>《代号零》与《山海经》  |  风格</w:t>
+      </w:r>
+      <w:r>
+        <w:rPr>
+          <w:rFonts w:hint="eastAsia" w:ascii="微软雅黑" w:hAnsi="微软雅黑" w:eastAsia="微软雅黑" w:cs="微软雅黑"/>
+          <w:b/>
+          <w:color w:val="2F5B78"/>
+          <w:sz w:val="21"/>
+          <w:szCs w:val="20"/>
+          <w:lang w:val="en-US" w:eastAsia="zh-CN"/>
+        </w:rPr>
+        <w:t>主笔和赋能、</w:t>
+      </w:r>
+      <w:r>
+        <w:rPr>
+          <w:rFonts w:hint="eastAsia" w:ascii="微软雅黑" w:hAnsi="微软雅黑" w:eastAsia="微软雅黑" w:cs="微软雅黑"/>
+          <w:b/>
+          <w:color w:val="2F5B78"/>
+          <w:sz w:val="21"/>
+          <w:szCs w:val="20"/>
+        </w:rPr>
+        <w:t>关键角色设计</w:t>
       </w:r>
     </w:p>
     <w:p>
@@ -1336,9 +1493,8 @@
     <w:p>
       <w:pPr>
         <w:keepNext/>
-        <w:shd w:val="clear" w:fill="F1F2F3"/>
-        <w:spacing w:before="120" w:after="80" w:line="400" w:lineRule="exact"/>
-        <w:ind w:left="57" w:right="57"/>
+        <w:keepLines/>
+        <w:spacing w:before="80" w:after="40"/>
         <w:rPr>
           <w:rFonts w:hint="eastAsia" w:ascii="微软雅黑" w:hAnsi="微软雅黑" w:eastAsia="微软雅黑" w:cs="微软雅黑"/>
           <w:sz w:val="21"/>
@@ -1348,55 +1504,182 @@
       <w:r>
         <w:rPr>
           <w:rFonts w:hint="eastAsia" w:ascii="微软雅黑" w:hAnsi="微软雅黑" w:eastAsia="微软雅黑" w:cs="微软雅黑"/>
-          <w:sz w:val="21"/>
-          <w:szCs w:val="20"/>
-        </w:rPr>
-        <w:drawing>
-          <wp:inline distT="0" distB="0" distL="114300" distR="114300">
-            <wp:extent cx="467995" cy="183515"/>
-            <wp:effectExtent l="0" t="0" r="8255" b="6985"/>
-            <wp:docPr id="6" name="Picture 6"/>
-            <wp:cNvGraphicFramePr>
-              <a:graphicFrameLocks xmlns:a="http://schemas.openxmlformats.org/drawingml/2006/main" noChangeAspect="1"/>
-            </wp:cNvGraphicFramePr>
-            <a:graphic xmlns:a="http://schemas.openxmlformats.org/drawingml/2006/main">
-              <a:graphicData uri="http://schemas.openxmlformats.org/drawingml/2006/picture">
-                <pic:pic xmlns:pic="http://schemas.openxmlformats.org/drawingml/2006/picture">
-                  <pic:nvPicPr>
-                    <pic:cNvPr id="6" name="Picture 6"/>
-                    <pic:cNvPicPr>
-                      <a:picLocks noChangeAspect="1"/>
-                    </pic:cNvPicPr>
-                  </pic:nvPicPr>
-                  <pic:blipFill>
-                    <a:blip r:embed="rId11"/>
-                    <a:stretch>
-                      <a:fillRect/>
-                    </a:stretch>
-                  </pic:blipFill>
-                  <pic:spPr>
-                    <a:xfrm>
-                      <a:off x="0" y="0"/>
-                      <a:ext cx="468000" cy="184000"/>
-                    </a:xfrm>
-                    <a:prstGeom prst="rect">
-                      <a:avLst/>
-                    </a:prstGeom>
-                  </pic:spPr>
-                </pic:pic>
-              </a:graphicData>
-            </a:graphic>
-          </wp:inline>
-        </w:drawing>
-      </w:r>
-      <w:r>
-        <w:rPr>
-          <w:rFonts w:hint="eastAsia" w:ascii="微软雅黑" w:hAnsi="微软雅黑" w:eastAsia="微软雅黑" w:cs="微软雅黑"/>
           <w:b/>
-          <w:sz w:val="16"/>
-          <w:szCs w:val="20"/>
-        </w:rPr>
-        <w:t xml:space="preserve">  西山居  |  团队管理与生产流程建设  |  2016.05 至今</w:t>
+          <w:color w:val="2F5B78"/>
+          <w:sz w:val="21"/>
+          <w:szCs w:val="20"/>
+        </w:rPr>
+        <w:t>25人以上美术团队统筹  |  质量审核与版本交付</w:t>
+      </w:r>
+    </w:p>
+    <w:p>
+      <w:pPr>
+        <w:keepLines/>
+        <w:spacing w:before="0" w:after="50"/>
+        <w:ind w:left="170" w:hanging="170"/>
+        <w:rPr>
+          <w:rFonts w:hint="eastAsia" w:ascii="微软雅黑" w:hAnsi="微软雅黑" w:eastAsia="微软雅黑" w:cs="微软雅黑"/>
+          <w:sz w:val="21"/>
+          <w:szCs w:val="20"/>
+        </w:rPr>
+      </w:pPr>
+      <w:r>
+        <w:rPr>
+          <w:rFonts w:hint="eastAsia" w:ascii="微软雅黑" w:hAnsi="微软雅黑" w:eastAsia="微软雅黑" w:cs="微软雅黑"/>
+          <w:sz w:val="21"/>
+          <w:szCs w:val="20"/>
+        </w:rPr>
+        <w:t xml:space="preserve">• </w:t>
+      </w:r>
+      <w:r>
+        <w:rPr>
+          <w:rFonts w:hint="eastAsia" w:ascii="微软雅黑" w:hAnsi="微软雅黑" w:eastAsia="微软雅黑" w:cs="微软雅黑"/>
+          <w:b/>
+          <w:sz w:val="21"/>
+          <w:szCs w:val="20"/>
+        </w:rPr>
+        <w:t>我的职责：</w:t>
+      </w:r>
+      <w:r>
+        <w:rPr>
+          <w:rFonts w:hint="eastAsia" w:ascii="微软雅黑" w:hAnsi="微软雅黑" w:eastAsia="微软雅黑" w:cs="微软雅黑"/>
+          <w:b w:val="0"/>
+          <w:sz w:val="21"/>
+          <w:szCs w:val="20"/>
+        </w:rPr>
+        <w:t>曾统筹</w:t>
+      </w:r>
+      <w:r>
+        <w:rPr>
+          <w:rFonts w:hint="eastAsia" w:ascii="微软雅黑" w:hAnsi="微软雅黑" w:eastAsia="微软雅黑" w:cs="微软雅黑"/>
+          <w:b/>
+          <w:sz w:val="21"/>
+          <w:szCs w:val="20"/>
+        </w:rPr>
+        <w:t>25人以上</w:t>
+      </w:r>
+      <w:r>
+        <w:rPr>
+          <w:rFonts w:hint="eastAsia" w:ascii="微软雅黑" w:hAnsi="微软雅黑" w:eastAsia="微软雅黑" w:cs="微软雅黑"/>
+          <w:b w:val="0"/>
+          <w:sz w:val="21"/>
+          <w:szCs w:val="20"/>
+        </w:rPr>
+        <w:t>项目美术团队，覆盖角色原画、模型、动作、特效与场景等岗位；结合成员特长分配任务，开展专业指导及审核反馈。</w:t>
+      </w:r>
+    </w:p>
+    <w:p>
+      <w:pPr>
+        <w:keepLines/>
+        <w:spacing w:before="0" w:after="50"/>
+        <w:ind w:left="340" w:hanging="170"/>
+        <w:rPr>
+          <w:rFonts w:hint="eastAsia" w:ascii="微软雅黑" w:hAnsi="微软雅黑" w:eastAsia="微软雅黑" w:cs="微软雅黑"/>
+          <w:sz w:val="21"/>
+          <w:szCs w:val="20"/>
+        </w:rPr>
+      </w:pPr>
+      <w:r>
+        <w:rPr>
+          <w:rFonts w:hint="eastAsia" w:ascii="微软雅黑" w:hAnsi="微软雅黑" w:eastAsia="微软雅黑" w:cs="微软雅黑"/>
+          <w:sz w:val="21"/>
+          <w:szCs w:val="20"/>
+        </w:rPr>
+        <w:t xml:space="preserve">◦ </w:t>
+      </w:r>
+      <w:r>
+        <w:rPr>
+          <w:rFonts w:hint="eastAsia" w:ascii="微软雅黑" w:hAnsi="微软雅黑" w:eastAsia="微软雅黑" w:cs="微软雅黑"/>
+          <w:b/>
+          <w:sz w:val="21"/>
+          <w:szCs w:val="20"/>
+        </w:rPr>
+        <w:t>项目统筹：</w:t>
+      </w:r>
+      <w:r>
+        <w:rPr>
+          <w:rFonts w:hint="eastAsia" w:ascii="微软雅黑" w:hAnsi="微软雅黑" w:eastAsia="微软雅黑" w:cs="微软雅黑"/>
+          <w:b w:val="0"/>
+          <w:sz w:val="21"/>
+          <w:szCs w:val="20"/>
+        </w:rPr>
+        <w:t>联动市场、策划、PM和美术岗位，协调需求、排期和人员安排；</w:t>
+      </w:r>
+    </w:p>
+    <w:p>
+      <w:pPr>
+        <w:keepLines/>
+        <w:spacing w:before="0" w:after="50"/>
+        <w:ind w:left="340" w:hanging="170"/>
+        <w:rPr>
+          <w:rFonts w:hint="eastAsia" w:ascii="微软雅黑" w:hAnsi="微软雅黑" w:eastAsia="微软雅黑" w:cs="微软雅黑"/>
+          <w:sz w:val="21"/>
+          <w:szCs w:val="20"/>
+        </w:rPr>
+      </w:pPr>
+      <w:r>
+        <w:rPr>
+          <w:rFonts w:hint="eastAsia" w:ascii="微软雅黑" w:hAnsi="微软雅黑" w:eastAsia="微软雅黑" w:cs="微软雅黑"/>
+          <w:sz w:val="21"/>
+          <w:szCs w:val="20"/>
+        </w:rPr>
+        <w:t xml:space="preserve">◦ </w:t>
+      </w:r>
+      <w:r>
+        <w:rPr>
+          <w:rFonts w:hint="eastAsia" w:ascii="微软雅黑" w:hAnsi="微软雅黑" w:eastAsia="微软雅黑" w:cs="微软雅黑"/>
+          <w:b/>
+          <w:sz w:val="21"/>
+          <w:szCs w:val="20"/>
+        </w:rPr>
+        <w:t>外包与成本：</w:t>
+      </w:r>
+      <w:r>
+        <w:rPr>
+          <w:rFonts w:hint="eastAsia" w:ascii="微软雅黑" w:hAnsi="微软雅黑" w:eastAsia="微软雅黑" w:cs="微软雅黑"/>
+          <w:b w:val="0"/>
+          <w:sz w:val="21"/>
+          <w:szCs w:val="20"/>
+        </w:rPr>
+        <w:t>参与成本与合同协商，兼顾品质与制作条件。</w:t>
+      </w:r>
+    </w:p>
+    <w:p>
+      <w:pPr>
+        <w:keepLines/>
+        <w:spacing w:before="0" w:after="50"/>
+        <w:ind w:left="170" w:hanging="170"/>
+        <w:rPr>
+          <w:rFonts w:hint="eastAsia" w:ascii="微软雅黑" w:hAnsi="微软雅黑" w:eastAsia="微软雅黑" w:cs="微软雅黑"/>
+          <w:sz w:val="21"/>
+          <w:szCs w:val="20"/>
+        </w:rPr>
+      </w:pPr>
+      <w:r>
+        <w:rPr>
+          <w:rFonts w:hint="eastAsia" w:ascii="微软雅黑" w:hAnsi="微软雅黑" w:eastAsia="微软雅黑" w:cs="微软雅黑"/>
+          <w:sz w:val="21"/>
+          <w:szCs w:val="20"/>
+        </w:rPr>
+        <w:t xml:space="preserve">• </w:t>
+      </w:r>
+      <w:r>
+        <w:rPr>
+          <w:rFonts w:hint="eastAsia" w:ascii="微软雅黑" w:hAnsi="微软雅黑" w:eastAsia="微软雅黑" w:cs="微软雅黑"/>
+          <w:b/>
+          <w:sz w:val="21"/>
+          <w:szCs w:val="20"/>
+        </w:rPr>
+        <w:t>交付成果：</w:t>
+      </w:r>
+      <w:r>
+        <w:rPr>
+          <w:rFonts w:hint="eastAsia" w:ascii="微软雅黑" w:hAnsi="微软雅黑" w:eastAsia="微软雅黑" w:cs="微软雅黑"/>
+          <w:b w:val="0"/>
+          <w:sz w:val="21"/>
+          <w:szCs w:val="20"/>
+        </w:rPr>
+        <w:t>多次在任务量增加时提前完成交付，并通过资源调配与交接，降低人员变动对制作和交付的影响。</w:t>
       </w:r>
     </w:p>
     <w:p>
@@ -1418,190 +1701,8 @@
           <w:sz w:val="21"/>
           <w:szCs w:val="20"/>
         </w:rPr>
-        <w:t>25人以上美术团队统筹  |  质量审核与版本交付</w:t>
-      </w:r>
-    </w:p>
-    <w:p>
-      <w:pPr>
-        <w:keepLines/>
-        <w:spacing w:before="0" w:after="50"/>
-        <w:ind w:left="170" w:hanging="170"/>
-        <w:rPr>
-          <w:rFonts w:hint="eastAsia" w:ascii="微软雅黑" w:hAnsi="微软雅黑" w:eastAsia="微软雅黑" w:cs="微软雅黑"/>
-          <w:sz w:val="21"/>
-          <w:szCs w:val="20"/>
-        </w:rPr>
-      </w:pPr>
-      <w:r>
-        <w:rPr>
-          <w:rFonts w:hint="eastAsia" w:ascii="微软雅黑" w:hAnsi="微软雅黑" w:eastAsia="微软雅黑" w:cs="微软雅黑"/>
-          <w:sz w:val="21"/>
-          <w:szCs w:val="20"/>
-        </w:rPr>
-        <w:t xml:space="preserve">• </w:t>
-      </w:r>
-      <w:r>
-        <w:rPr>
-          <w:rFonts w:hint="eastAsia" w:ascii="微软雅黑" w:hAnsi="微软雅黑" w:eastAsia="微软雅黑" w:cs="微软雅黑"/>
-          <w:b/>
-          <w:sz w:val="21"/>
-          <w:szCs w:val="20"/>
-        </w:rPr>
-        <w:t>我的职责：</w:t>
-      </w:r>
-      <w:r>
-        <w:rPr>
-          <w:rFonts w:hint="eastAsia" w:ascii="微软雅黑" w:hAnsi="微软雅黑" w:eastAsia="微软雅黑" w:cs="微软雅黑"/>
-          <w:b w:val="0"/>
-          <w:sz w:val="21"/>
-          <w:szCs w:val="20"/>
-        </w:rPr>
-        <w:t>曾统筹</w:t>
-      </w:r>
-      <w:r>
-        <w:rPr>
-          <w:rFonts w:hint="eastAsia" w:ascii="微软雅黑" w:hAnsi="微软雅黑" w:eastAsia="微软雅黑" w:cs="微软雅黑"/>
-          <w:b/>
-          <w:sz w:val="21"/>
-          <w:szCs w:val="20"/>
-        </w:rPr>
-        <w:t>25人以上</w:t>
-      </w:r>
-      <w:r>
-        <w:rPr>
-          <w:rFonts w:hint="eastAsia" w:ascii="微软雅黑" w:hAnsi="微软雅黑" w:eastAsia="微软雅黑" w:cs="微软雅黑"/>
-          <w:b w:val="0"/>
-          <w:sz w:val="21"/>
-          <w:szCs w:val="20"/>
-        </w:rPr>
-        <w:t>项目美术团队，覆盖角色原画、模型、动作、特效与场景等岗位；结合成员特长分配任务，开展专业指导及审核反馈。</w:t>
-      </w:r>
-    </w:p>
-    <w:p>
-      <w:pPr>
-        <w:keepLines/>
-        <w:spacing w:before="0" w:after="50"/>
-        <w:ind w:left="340" w:hanging="170"/>
-        <w:rPr>
-          <w:rFonts w:hint="eastAsia" w:ascii="微软雅黑" w:hAnsi="微软雅黑" w:eastAsia="微软雅黑" w:cs="微软雅黑"/>
-          <w:sz w:val="21"/>
-          <w:szCs w:val="20"/>
-        </w:rPr>
-      </w:pPr>
-      <w:r>
-        <w:rPr>
-          <w:rFonts w:hint="eastAsia" w:ascii="微软雅黑" w:hAnsi="微软雅黑" w:eastAsia="微软雅黑" w:cs="微软雅黑"/>
-          <w:sz w:val="21"/>
-          <w:szCs w:val="20"/>
-        </w:rPr>
-        <w:t xml:space="preserve">◦ </w:t>
-      </w:r>
-      <w:r>
-        <w:rPr>
-          <w:rFonts w:hint="eastAsia" w:ascii="微软雅黑" w:hAnsi="微软雅黑" w:eastAsia="微软雅黑" w:cs="微软雅黑"/>
-          <w:b/>
-          <w:sz w:val="21"/>
-          <w:szCs w:val="20"/>
-        </w:rPr>
-        <w:t>项目统筹：</w:t>
-      </w:r>
-      <w:r>
-        <w:rPr>
-          <w:rFonts w:hint="eastAsia" w:ascii="微软雅黑" w:hAnsi="微软雅黑" w:eastAsia="微软雅黑" w:cs="微软雅黑"/>
-          <w:b w:val="0"/>
-          <w:sz w:val="21"/>
-          <w:szCs w:val="20"/>
-        </w:rPr>
-        <w:t>联动市场、策划、PM和美术岗位，协调需求、排期和人员安排；</w:t>
-      </w:r>
-    </w:p>
-    <w:p>
-      <w:pPr>
-        <w:keepLines/>
-        <w:spacing w:before="0" w:after="50"/>
-        <w:ind w:left="340" w:hanging="170"/>
-        <w:rPr>
-          <w:rFonts w:hint="eastAsia" w:ascii="微软雅黑" w:hAnsi="微软雅黑" w:eastAsia="微软雅黑" w:cs="微软雅黑"/>
-          <w:sz w:val="21"/>
-          <w:szCs w:val="20"/>
-        </w:rPr>
-      </w:pPr>
-      <w:r>
-        <w:rPr>
-          <w:rFonts w:hint="eastAsia" w:ascii="微软雅黑" w:hAnsi="微软雅黑" w:eastAsia="微软雅黑" w:cs="微软雅黑"/>
-          <w:sz w:val="21"/>
-          <w:szCs w:val="20"/>
-        </w:rPr>
-        <w:t xml:space="preserve">◦ </w:t>
-      </w:r>
-      <w:r>
-        <w:rPr>
-          <w:rFonts w:hint="eastAsia" w:ascii="微软雅黑" w:hAnsi="微软雅黑" w:eastAsia="微软雅黑" w:cs="微软雅黑"/>
-          <w:b/>
-          <w:sz w:val="21"/>
-          <w:szCs w:val="20"/>
-        </w:rPr>
-        <w:t>外包与成本：</w:t>
-      </w:r>
-      <w:r>
-        <w:rPr>
-          <w:rFonts w:hint="eastAsia" w:ascii="微软雅黑" w:hAnsi="微软雅黑" w:eastAsia="微软雅黑" w:cs="微软雅黑"/>
-          <w:b w:val="0"/>
-          <w:sz w:val="21"/>
-          <w:szCs w:val="20"/>
-        </w:rPr>
-        <w:t>参与成本与合同协商，兼顾品质与制作条件。</w:t>
-      </w:r>
-    </w:p>
-    <w:p>
-      <w:pPr>
-        <w:keepLines/>
-        <w:spacing w:before="0" w:after="50"/>
-        <w:ind w:left="170" w:hanging="170"/>
-        <w:rPr>
-          <w:rFonts w:hint="eastAsia" w:ascii="微软雅黑" w:hAnsi="微软雅黑" w:eastAsia="微软雅黑" w:cs="微软雅黑"/>
-          <w:sz w:val="21"/>
-          <w:szCs w:val="20"/>
-        </w:rPr>
-      </w:pPr>
-      <w:r>
-        <w:rPr>
-          <w:rFonts w:hint="eastAsia" w:ascii="微软雅黑" w:hAnsi="微软雅黑" w:eastAsia="微软雅黑" w:cs="微软雅黑"/>
-          <w:sz w:val="21"/>
-          <w:szCs w:val="20"/>
-        </w:rPr>
-        <w:t xml:space="preserve">• </w:t>
-      </w:r>
-      <w:r>
-        <w:rPr>
-          <w:rFonts w:hint="eastAsia" w:ascii="微软雅黑" w:hAnsi="微软雅黑" w:eastAsia="微软雅黑" w:cs="微软雅黑"/>
-          <w:b/>
-          <w:sz w:val="21"/>
-          <w:szCs w:val="20"/>
-        </w:rPr>
-        <w:t>交付成果：</w:t>
-      </w:r>
-      <w:r>
-        <w:rPr>
-          <w:rFonts w:hint="eastAsia" w:ascii="微软雅黑" w:hAnsi="微软雅黑" w:eastAsia="微软雅黑" w:cs="微软雅黑"/>
-          <w:b w:val="0"/>
-          <w:sz w:val="21"/>
-          <w:szCs w:val="20"/>
-        </w:rPr>
-        <w:t>多次在任务量增加时提前完成交付，并通过资源调配与交接，降低人员变动对制作和交付的影响。</w:t>
-      </w:r>
-    </w:p>
-    <w:p>
-      <w:pPr>
-        <w:keepNext/>
-        <w:keepLines/>
-        <w:spacing w:before="80" w:after="40"/>
-        <w:rPr>
-          <w:rFonts w:hint="eastAsia" w:ascii="微软雅黑" w:hAnsi="微软雅黑" w:eastAsia="微软雅黑" w:cs="微软雅黑"/>
-          <w:sz w:val="21"/>
-          <w:szCs w:val="20"/>
-        </w:rPr>
-      </w:pPr>
+        <w:t xml:space="preserve">AI辅助制作流程  |  </w:t>
+      </w:r>
       <w:r>
         <w:rPr>
           <w:rFonts w:hint="eastAsia" w:ascii="微软雅黑" w:hAnsi="微软雅黑" w:eastAsia="微软雅黑" w:cs="微软雅黑"/>
@@ -1609,8 +1710,19 @@
           <w:color w:val="2F5B78"/>
           <w:sz w:val="21"/>
           <w:szCs w:val="20"/>
-        </w:rPr>
-        <w:t>AI辅助制作流程  |  2D设计与卡牌插画提效</w:t>
+          <w:lang w:val="en-US" w:eastAsia="zh-CN"/>
+        </w:rPr>
+        <w:t>角色</w:t>
+      </w:r>
+      <w:r>
+        <w:rPr>
+          <w:rFonts w:hint="eastAsia" w:ascii="微软雅黑" w:hAnsi="微软雅黑" w:eastAsia="微软雅黑" w:cs="微软雅黑"/>
+          <w:b/>
+          <w:color w:val="2F5B78"/>
+          <w:sz w:val="21"/>
+          <w:szCs w:val="20"/>
+        </w:rPr>
+        <w:t>设计与卡牌插画提效</w:t>
       </w:r>
     </w:p>
     <w:p>
@@ -1942,20 +2054,20 @@
         <w:ind w:left="57" w:right="57"/>
         <w:rPr>
           <w:rFonts w:hint="eastAsia" w:ascii="微软雅黑" w:hAnsi="微软雅黑" w:eastAsia="微软雅黑" w:cs="微软雅黑"/>
-          <w:sz w:val="21"/>
-          <w:szCs w:val="20"/>
+          <w:sz w:val="24"/>
+          <w:szCs w:val="22"/>
         </w:rPr>
       </w:pPr>
       <w:r>
         <w:rPr>
           <w:rFonts w:hint="eastAsia" w:ascii="微软雅黑" w:hAnsi="微软雅黑" w:eastAsia="微软雅黑" w:cs="微软雅黑"/>
-          <w:sz w:val="21"/>
-          <w:szCs w:val="20"/>
+          <w:sz w:val="24"/>
+          <w:szCs w:val="22"/>
         </w:rPr>
         <w:drawing>
           <wp:inline distT="0" distB="0" distL="114300" distR="114300">
-            <wp:extent cx="467995" cy="153035"/>
-            <wp:effectExtent l="0" t="0" r="8255" b="18415"/>
+            <wp:extent cx="908050" cy="297180"/>
+            <wp:effectExtent l="0" t="0" r="6350" b="7620"/>
             <wp:docPr id="7" name="Picture 7"/>
             <wp:cNvGraphicFramePr>
               <a:graphicFrameLocks xmlns:a="http://schemas.openxmlformats.org/drawingml/2006/main" noChangeAspect="1"/>
@@ -1978,7 +2090,7 @@
                   <pic:spPr>
                     <a:xfrm>
                       <a:off x="0" y="0"/>
-                      <a:ext cx="468000" cy="153356"/>
+                      <a:ext cx="908050" cy="297180"/>
                     </a:xfrm>
                     <a:prstGeom prst="rect">
                       <a:avLst/>
@@ -1994,8 +2106,8 @@
         <w:rPr>
           <w:rFonts w:hint="eastAsia" w:ascii="微软雅黑" w:hAnsi="微软雅黑" w:eastAsia="微软雅黑" w:cs="微软雅黑"/>
           <w:b/>
-          <w:sz w:val="16"/>
-          <w:szCs w:val="20"/>
+          <w:sz w:val="20"/>
+          <w:szCs w:val="22"/>
         </w:rPr>
         <w:t xml:space="preserve">  网易（广州）网络有限公司  |  2013.07 至 2016.05</w:t>
       </w:r>
@@ -2218,8 +2330,6 @@
         </w:rPr>
         <w:t>Codex、Claud code等应用辅助工作；</w:t>
       </w:r>
-      <w:bookmarkStart w:id="0" w:name="_GoBack"/>
-      <w:bookmarkEnd w:id="0"/>
       <w:r>
         <w:rPr>
           <w:rFonts w:hint="eastAsia" w:ascii="微软雅黑" w:hAnsi="微软雅黑" w:eastAsia="微软雅黑" w:cs="微软雅黑"/>
@@ -2503,8 +2613,8 @@
     <w:lsdException w:uiPriority="99" w:name="Normal Indent"/>
     <w:lsdException w:uiPriority="99" w:name="footnote text"/>
     <w:lsdException w:uiPriority="99" w:name="annotation text"/>
-    <w:lsdException w:uiPriority="99" w:semiHidden="0" w:name="header"/>
-    <w:lsdException w:uiPriority="99" w:semiHidden="0" w:name="footer"/>
+    <w:lsdException w:qFormat="1" w:uiPriority="99" w:semiHidden="0" w:name="header"/>
+    <w:lsdException w:qFormat="1" w:uiPriority="99" w:semiHidden="0" w:name="footer"/>
     <w:lsdException w:uiPriority="99" w:name="index heading"/>
     <w:lsdException w:qFormat="1" w:uiPriority="35" w:name="caption"/>
     <w:lsdException w:uiPriority="99" w:name="table of figures"/>
@@ -3215,6 +3325,7 @@
     <w:basedOn w:val="1"/>
     <w:link w:val="136"/>
     <w:unhideWhenUsed/>
+    <w:qFormat/>
     <w:uiPriority w:val="99"/>
     <w:pPr>
       <w:tabs>
@@ -3234,6 +3345,7 @@
     <w:basedOn w:val="1"/>
     <w:link w:val="135"/>
     <w:unhideWhenUsed/>
+    <w:qFormat/>
     <w:uiPriority w:val="99"/>
     <w:pPr>
       <w:tabs>

</xml_diff>